<commit_message>
feat: segurança de segredos, logging/tqdm e docs PDJ com supervisor Marcelo
Remove a API key do config versionado (secrets.yaml local), adiciona
módulo de segurança e hardenings de load; reforça logging/debug/tqdm;
documenta scripts; atualiza submissão para Lab. de Entomologia / Marcelo.

Co-authored-by: Cursor <cursoragent@cursor.com>
</commit_message>
<xml_diff>
--- a/submissao_pdj/Carta_de_Anuencia_PDJ.docx
+++ b/submissao_pdj/Carta_de_Anuencia_PDJ.docx
@@ -38,7 +38,7 @@
           <w:color w:val="555555"/>
           <w:sz w:val="20"/>
         </w:rPr>
-        <w:t>[Laboratório / Departamento / Grupo de Pesquisa]</w:t>
+        <w:t>Laboratório de Entomologia</w:t>
       </w:r>
     </w:p>
     <w:p/>
@@ -156,7 +156,7 @@
           <w:i w:val="0"/>
           <w:sz w:val="22"/>
         </w:rPr>
-        <w:t>Na qualidade de [cargo — ex.: chefe do Laboratório / chefe do Departamento / líder do Grupo de Pesquisa] do(a) [nome do laboratório / departamento / grupo] do Instituto Aggeu Magalhães (IAM) — Fiocruz Pernambuco, declaro estar CIENTE e DE ACORDO com a realização do subprojeto intitulado “JEPA-Spillover: aprendizado preditivo em espaço latente para vigilância genômica de vírus com potencial zoonótico”, a ser desenvolvido pelo(a) candidato(a) Gabriel Bezerra Motta Câmara, sob supervisão do(a) Prof.(a) [nome do(a) supervisor(a)], no âmbito do Edital de Pós-Doutorado Júnior (PDJ) da VPPCB/Fiocruz, vigência 2026–2027.</w:t>
+        <w:t>Na qualidade de [cargo — ex.: chefe do Laboratório / chefe do Departamento / líder do Grupo de Pesquisa] do Laboratório de Entomologia do Instituto Aggeu Magalhães (IAM) — Fiocruz Pernambuco, declaro estar CIENTE e DE ACORDO com a realização do subprojeto intitulado “JEPA-Spillover: aprendizado preditivo em espaço latente para vigilância genômica de vírus com potencial zoonótico”, a ser desenvolvido pelo(a) candidato(a) Gabriel Bezerra Motta Câmara, sob supervisão do(a) Prof.(a) Marcelo Henrique Santos Paiva, no âmbito do Edital de Pós-Doutorado Júnior (PDJ) da VPPCB/Fiocruz, vigência 2026–2027.</w:t>
       </w:r>
     </w:p>
     <w:p>
@@ -245,10 +245,10 @@
       </w:pPr>
       <w:r>
         <w:rPr>
-          <w:color w:val="555555"/>
+          <w:color w:val="000000"/>
           <w:sz w:val="20"/>
         </w:rPr>
-        <w:t>[Laboratório / Departamento / Grupo de Pesquisa]</w:t>
+        <w:t>Laboratório de Entomologia</w:t>
       </w:r>
     </w:p>
     <w:p>

</xml_diff>